<commit_message>
Restructure Embafinans section: two-layer Projects + Methodology format
</commit_message>
<xml_diff>
--- a/download/Zamir_Camalov_BA_CV_EN.docx
+++ b/download/Zamir_Camalov_BA_CV_EN.docx
@@ -519,6 +519,184 @@
     </w:p>
     <w:p>
       <w:pPr>
+        <w:spacing w:after="20" w:before="100" w:line="260"/>
+      </w:pPr>
+      <w:r>
+        <w:rPr>
+          <w:rFonts w:ascii="Calibri" w:eastAsia="Microsoft YaHei"/>
+          <w:b/>
+          <w:bCs/>
+          <w:i/>
+          <w:iCs/>
+          <w:color w:val="1A1A1A"/>
+          <w:spacing w:val="40"/>
+          <w:sz w:val="18"/>
+          <w:szCs w:val="18"/>
+        </w:rPr>
+        <w:t xml:space="preserve">Projects Delivered</w:t>
+      </w:r>
+    </w:p>
+    <w:p>
+      <w:pPr>
+        <w:spacing w:after="10" w:before="10" w:line="250"/>
+        <w:ind w:left="200" w:hanging="200"/>
+      </w:pPr>
+      <w:r>
+        <w:rPr>
+          <w:rFonts w:ascii="Calibri" w:eastAsia="Microsoft YaHei"/>
+          <w:color w:val="2A6496"/>
+          <w:sz w:val="17"/>
+          <w:szCs w:val="17"/>
+        </w:rPr>
+        <w:t xml:space="preserve">•</w:t>
+      </w:r>
+      <w:r>
+        <w:rPr>
+          <w:rFonts w:ascii="Calibri" w:eastAsia="Microsoft YaHei"/>
+          <w:b/>
+          <w:bCs/>
+          <w:color w:val="1A1A1A"/>
+          <w:sz w:val="17"/>
+          <w:szCs w:val="17"/>
+        </w:rPr>
+        <w:t xml:space="preserve">  BNPL Credit Scoring &amp; Pre-Screen Risk Assessment  </w:t>
+      </w:r>
+      <w:r>
+        <w:rPr>
+          <w:rFonts w:ascii="Calibri" w:eastAsia="Microsoft YaHei"/>
+          <w:color w:val="777777"/>
+          <w:sz w:val="16"/>
+          <w:szCs w:val="16"/>
+        </w:rPr>
+        <w:t xml:space="preserve">(AKB, ASANfinance, BPMN)</w:t>
+      </w:r>
+    </w:p>
+    <w:p>
+      <w:pPr>
+        <w:spacing w:after="10" w:before="10" w:line="250"/>
+        <w:ind w:left="200" w:hanging="200"/>
+      </w:pPr>
+      <w:r>
+        <w:rPr>
+          <w:rFonts w:ascii="Calibri" w:eastAsia="Microsoft YaHei"/>
+          <w:color w:val="2A6496"/>
+          <w:sz w:val="17"/>
+          <w:szCs w:val="17"/>
+        </w:rPr>
+        <w:t xml:space="preserve">•</w:t>
+      </w:r>
+      <w:r>
+        <w:rPr>
+          <w:rFonts w:ascii="Calibri" w:eastAsia="Microsoft YaHei"/>
+          <w:b/>
+          <w:bCs/>
+          <w:color w:val="1A1A1A"/>
+          <w:sz w:val="17"/>
+          <w:szCs w:val="17"/>
+        </w:rPr>
+        <w:t xml:space="preserve">  Sales Channel &amp; Payment Integration  </w:t>
+      </w:r>
+      <w:r>
+        <w:rPr>
+          <w:rFonts w:ascii="Calibri" w:eastAsia="Microsoft YaHei"/>
+          <w:color w:val="777777"/>
+          <w:sz w:val="16"/>
+          <w:szCs w:val="16"/>
+        </w:rPr>
+        <w:t xml:space="preserve">(3rd-Party Credit Applications, PayTabs)</w:t>
+      </w:r>
+    </w:p>
+    <w:p>
+      <w:pPr>
+        <w:spacing w:after="10" w:before="10" w:line="250"/>
+        <w:ind w:left="200" w:hanging="200"/>
+      </w:pPr>
+      <w:r>
+        <w:rPr>
+          <w:rFonts w:ascii="Calibri" w:eastAsia="Microsoft YaHei"/>
+          <w:color w:val="2A6496"/>
+          <w:sz w:val="17"/>
+          <w:szCs w:val="17"/>
+        </w:rPr>
+        <w:t xml:space="preserve">•</w:t>
+      </w:r>
+      <w:r>
+        <w:rPr>
+          <w:rFonts w:ascii="Calibri" w:eastAsia="Microsoft YaHei"/>
+          <w:b/>
+          <w:bCs/>
+          <w:color w:val="1A1A1A"/>
+          <w:sz w:val="17"/>
+          <w:szCs w:val="17"/>
+        </w:rPr>
+        <w:t xml:space="preserve">  Goods Loan Delivery Dashboard  </w:t>
+      </w:r>
+      <w:r>
+        <w:rPr>
+          <w:rFonts w:ascii="Calibri" w:eastAsia="Microsoft YaHei"/>
+          <w:color w:val="777777"/>
+          <w:sz w:val="16"/>
+          <w:szCs w:val="16"/>
+        </w:rPr>
+        <w:t xml:space="preserve">(Risk Monitoring, SIMA e-Signature, SMS)</w:t>
+      </w:r>
+    </w:p>
+    <w:p>
+      <w:pPr>
+        <w:spacing w:after="10" w:before="10" w:line="250"/>
+        <w:ind w:left="200" w:hanging="200"/>
+      </w:pPr>
+      <w:r>
+        <w:rPr>
+          <w:rFonts w:ascii="Calibri" w:eastAsia="Microsoft YaHei"/>
+          <w:color w:val="2A6496"/>
+          <w:sz w:val="17"/>
+          <w:szCs w:val="17"/>
+        </w:rPr>
+        <w:t xml:space="preserve">•</w:t>
+      </w:r>
+      <w:r>
+        <w:rPr>
+          <w:rFonts w:ascii="Calibri" w:eastAsia="Microsoft YaHei"/>
+          <w:b/>
+          <w:bCs/>
+          <w:color w:val="1A1A1A"/>
+          <w:sz w:val="17"/>
+          <w:szCs w:val="17"/>
+        </w:rPr>
+        <w:t xml:space="preserve">  Partner Onboarding &amp; Application Management  </w:t>
+      </w:r>
+      <w:r>
+        <w:rPr>
+          <w:rFonts w:ascii="Calibri" w:eastAsia="Microsoft YaHei"/>
+          <w:color w:val="777777"/>
+          <w:sz w:val="16"/>
+          <w:szCs w:val="16"/>
+        </w:rPr>
+        <w:t xml:space="preserve">(FRD, 8+ REST API Endpoints)</w:t>
+      </w:r>
+    </w:p>
+    <w:p>
+      <w:pPr>
+        <w:spacing w:after="20" w:before="100" w:line="260"/>
+      </w:pPr>
+      <w:r>
+        <w:rPr>
+          <w:rFonts w:ascii="Calibri" w:eastAsia="Microsoft YaHei"/>
+          <w:b/>
+          <w:bCs/>
+          <w:i/>
+          <w:iCs/>
+          <w:color w:val="1A1A1A"/>
+          <w:spacing w:val="40"/>
+          <w:sz w:val="18"/>
+          <w:szCs w:val="18"/>
+        </w:rPr>
+        <w:t xml:space="preserve">Delivery Methodology</w:t>
+      </w:r>
+    </w:p>
+    <w:p>
+      <w:pPr>
         <w:spacing w:after="16" w:before="16" w:line="260"/>
         <w:ind w:left="160" w:hanging="160"/>
       </w:pPr>
@@ -538,7 +716,7 @@
           <w:sz w:val="17"/>
           <w:szCs w:val="17"/>
         </w:rPr>
-        <w:t xml:space="preserve">  Conducted structured discovery sessions with risk teams to map the As-Is BNPL credit scoring workflow, designed a pre-screen scoring model by integrating external data sources (AKB, ASANfinance) for multi-factor risk assessment, and created To-Be BPMN process models with exclusive gateways — reducing credit decision time by 50%</w:t>
+        <w:t xml:space="preserve">  Conducted structured discovery sessions with risk, sales, and operations stakeholders to map As-Is workflows, design To-Be BPMN process models, and align on scope</w:t>
       </w:r>
     </w:p>
     <w:p>
@@ -562,7 +740,7 @@
           <w:sz w:val="17"/>
           <w:szCs w:val="17"/>
         </w:rPr>
-        <w:t xml:space="preserve">  Authored detailed FRDs with numbered requirements (REQ-101 format) and designed REST API specifications with Swagger/OpenAPI 3.0 documentation for 8+ endpoints covering partner onboarding, application management, and payment processing — ensuring zero-ambiguity handoff to the development team</w:t>
+        <w:t xml:space="preserve">  Authored detailed FRDs with numbered requirements (REQ-101 format) and designed REST API specifications using Swagger/OpenAPI 3.0 for seamless handoff to development teams</w:t>
       </w:r>
     </w:p>
     <w:p>
@@ -586,7 +764,7 @@
           <w:sz w:val="17"/>
           <w:szCs w:val="17"/>
         </w:rPr>
-        <w:t xml:space="preserve">  Wrote User Stories with Given/When/Then Acceptance Criteria in Jira/Confluence, coordinated UAT execution with business stakeholders, and led bug triage meetings with QA and developers — achieving on-time sign-off for 3 release cycles</w:t>
+        <w:t xml:space="preserve">  Wrote User Stories with Gherkin Acceptance Criteria, coordinated UAT execution, and led bug triage meetings — achieving on-time sign-off across multiple release cycles</w:t>
       </w:r>
     </w:p>
     <w:p>
@@ -610,55 +788,7 @@
           <w:sz w:val="17"/>
           <w:szCs w:val="17"/>
         </w:rPr>
-        <w:t xml:space="preserve">  Resolved conflicting priorities between Risk and Sales departments by presenting SQL-based data analysis (conversion funnel metrics) to both stakeholders, facilitating agreement on a unified partner onboarding workflow</w:t>
-      </w:r>
-    </w:p>
-    <w:p>
-      <w:pPr>
-        <w:spacing w:after="16" w:before="16" w:line="260"/>
-        <w:ind w:left="160" w:hanging="160"/>
-      </w:pPr>
-      <w:r>
-        <w:rPr>
-          <w:rFonts w:ascii="Calibri" w:eastAsia="Microsoft YaHei"/>
-          <w:color w:val="2A6496"/>
-          <w:sz w:val="17"/>
-          <w:szCs w:val="17"/>
-        </w:rPr>
-        <w:t xml:space="preserve">•</w:t>
-      </w:r>
-      <w:r>
-        <w:rPr>
-          <w:rFonts w:ascii="Calibri" w:eastAsia="Microsoft YaHei"/>
-          <w:color w:val="333333"/>
-          <w:sz w:val="17"/>
-          <w:szCs w:val="17"/>
-        </w:rPr>
-        <w:t xml:space="preserve">  Managed multiple third-party integrations including PayTabs payment processing and a new sales channel within the loan management system, conducting stakeholder sessions with vendors and internal teams to define API specifications and data mapping, and coordinating end-to-end delivery through UAT sign-off</w:t>
-      </w:r>
-    </w:p>
-    <w:p>
-      <w:pPr>
-        <w:spacing w:after="16" w:before="16" w:line="260"/>
-        <w:ind w:left="160" w:hanging="160"/>
-      </w:pPr>
-      <w:r>
-        <w:rPr>
-          <w:rFonts w:ascii="Calibri" w:eastAsia="Microsoft YaHei"/>
-          <w:color w:val="2A6496"/>
-          <w:sz w:val="17"/>
-          <w:szCs w:val="17"/>
-        </w:rPr>
-        <w:t xml:space="preserve">•</w:t>
-      </w:r>
-      <w:r>
-        <w:rPr>
-          <w:rFonts w:ascii="Calibri" w:eastAsia="Microsoft YaHei"/>
-          <w:color w:val="333333"/>
-          <w:sz w:val="17"/>
-          <w:szCs w:val="17"/>
-        </w:rPr>
-        <w:t xml:space="preserve">  Led the digitization of goods loan delivery monitoring for the risk department by conducting stakeholder sessions to map manual tracking workflows to an automated web-oriented dashboard, and defining API specifications for SIMA e-signature and SMS provider integrations, coordinating end-to-end delivery through UAT sign-off</w:t>
+        <w:t xml:space="preserve">  Leveraged SQL data analysis to resolve conflicting stakeholder priorities, presenting evidence-based recommendations to drive consensus</w:t>
       </w:r>
     </w:p>
     <w:p>

</xml_diff>